<commit_message>
Update resume, fix cohort size, add AIA photo
Co-Authored-By: Claude Sonnet 5 <noreply@anthropic.com>
</commit_message>
<xml_diff>
--- a/Kristen_Sng_Resume.docx
+++ b/Kristen_Sng_Resume.docx
@@ -22,29 +22,8 @@
       <w:pPr>
         <w:jc w:val="center"/>
       </w:pPr>
-      <w:proofErr w:type="gramStart"/>
-      <w:r>
-        <w:t>Singapore  |</w:t>
-      </w:r>
-      <w:proofErr w:type="gramEnd"/>
-      <w:r>
-        <w:t xml:space="preserve">  </w:t>
-      </w:r>
-      <w:proofErr w:type="gramStart"/>
-      <w:r>
-        <w:t>kristensngjialin@gmail.com  |</w:t>
-      </w:r>
-      <w:proofErr w:type="gramEnd"/>
-      <w:r>
-        <w:t xml:space="preserve">  +65 8266 </w:t>
-      </w:r>
-      <w:proofErr w:type="gramStart"/>
-      <w:r>
-        <w:t>5575  |</w:t>
-      </w:r>
-      <w:proofErr w:type="gramEnd"/>
-      <w:r>
-        <w:t xml:space="preserve">  </w:t>
+      <w:r>
+        <w:t xml:space="preserve">Singapore  |  kristensngjialin@gmail.com  |  +65 8266 5575  |  </w:t>
       </w:r>
       <w:hyperlink r:id="rId5" w:history="1">
         <w:r>
@@ -103,19 +82,7 @@
           <w:rPr>
             <w:rStyle w:val="Hyperlink"/>
           </w:rPr>
-          <w:t>Por</w:t>
-        </w:r>
-        <w:r>
-          <w:rPr>
-            <w:rStyle w:val="Hyperlink"/>
-          </w:rPr>
-          <w:t>t</w:t>
-        </w:r>
-        <w:r>
-          <w:rPr>
-            <w:rStyle w:val="Hyperlink"/>
-          </w:rPr>
-          <w:t>folio</w:t>
+          <w:t>Portfolio</w:t>
         </w:r>
       </w:hyperlink>
     </w:p>
@@ -314,21 +281,12 @@
         </w:tabs>
         <w:spacing w:before="20"/>
       </w:pPr>
-      <w:proofErr w:type="gramStart"/>
-      <w:r>
-        <w:rPr>
-          <w:b/>
-          <w:bCs/>
-        </w:rPr>
-        <w:t>Intern  |</w:t>
-      </w:r>
-      <w:proofErr w:type="gramEnd"/>
-      <w:r>
-        <w:rPr>
-          <w:b/>
-          <w:bCs/>
-        </w:rPr>
-        <w:t xml:space="preserve">  AIA</w:t>
+      <w:r>
+        <w:rPr>
+          <w:b/>
+          <w:bCs/>
+        </w:rPr>
+        <w:t>Intern  |  AIA</w:t>
       </w:r>
       <w:r>
         <w:tab/>
@@ -384,21 +342,12 @@
         </w:tabs>
         <w:spacing w:before="60"/>
       </w:pPr>
-      <w:proofErr w:type="gramStart"/>
-      <w:r>
-        <w:rPr>
-          <w:b/>
-          <w:bCs/>
-        </w:rPr>
-        <w:t>Intern  |</w:t>
-      </w:r>
-      <w:proofErr w:type="gramEnd"/>
-      <w:r>
-        <w:rPr>
-          <w:b/>
-          <w:bCs/>
-        </w:rPr>
-        <w:t xml:space="preserve">  </w:t>
+      <w:r>
+        <w:rPr>
+          <w:b/>
+          <w:bCs/>
+        </w:rPr>
+        <w:t xml:space="preserve">Intern  |  </w:t>
       </w:r>
       <w:proofErr w:type="spellStart"/>
       <w:r>
@@ -495,23 +444,7 @@
           <w:b/>
           <w:bCs/>
         </w:rPr>
-        <w:t xml:space="preserve">Hawker / Food Centre </w:t>
-      </w:r>
-      <w:proofErr w:type="gramStart"/>
-      <w:r>
-        <w:rPr>
-          <w:b/>
-          <w:bCs/>
-        </w:rPr>
-        <w:t>App  |</w:t>
-      </w:r>
-      <w:proofErr w:type="gramEnd"/>
-      <w:r>
-        <w:rPr>
-          <w:b/>
-          <w:bCs/>
-        </w:rPr>
-        <w:t xml:space="preserve">  INF2003 Database Systems</w:t>
+        <w:t>Hawker / Food Centre App  |  INF2003 Database Systems</w:t>
       </w:r>
       <w:r>
         <w:tab/>
@@ -560,23 +493,7 @@
           <w:b/>
           <w:bCs/>
         </w:rPr>
-        <w:t xml:space="preserve">Event Ticketing Web </w:t>
-      </w:r>
-      <w:proofErr w:type="gramStart"/>
-      <w:r>
-        <w:rPr>
-          <w:b/>
-          <w:bCs/>
-        </w:rPr>
-        <w:t>System  |</w:t>
-      </w:r>
-      <w:proofErr w:type="gramEnd"/>
-      <w:r>
-        <w:rPr>
-          <w:b/>
-          <w:bCs/>
-        </w:rPr>
-        <w:t xml:space="preserve">  PHP, MySQL, JavaScript, SVG</w:t>
+        <w:t>Event Ticketing Web System  |  PHP, MySQL, JavaScript, SVG</w:t>
       </w:r>
       <w:r>
         <w:tab/>
@@ -627,6 +544,174 @@
     </w:p>
     <w:p>
       <w:pPr>
+        <w:tabs>
+          <w:tab w:val="right" w:pos="10800"/>
+        </w:tabs>
+        <w:spacing w:before="60"/>
+        <w:rPr>
+          <w:b/>
+          <w:bCs/>
+        </w:rPr>
+      </w:pPr>
+      <w:r>
+        <w:rPr>
+          <w:b/>
+          <w:bCs/>
+        </w:rPr>
+        <w:t>Enterprise Network Design &amp; Security | Cisco IOS, VLANs, ACLs, Windows Server (NYP)</w:t>
+      </w:r>
+      <w:r>
+        <w:rPr>
+          <w:b/>
+          <w:bCs/>
+        </w:rPr>
+        <w:tab/>
+      </w:r>
+      <w:r>
+        <w:rPr>
+          <w:i/>
+          <w:iCs/>
+        </w:rPr>
+        <w:t>202</w:t>
+      </w:r>
+      <w:r>
+        <w:rPr>
+          <w:i/>
+          <w:iCs/>
+        </w:rPr>
+        <w:t>4</w:t>
+      </w:r>
+    </w:p>
+    <w:p>
+      <w:pPr>
+        <w:numPr>
+          <w:ilvl w:val="0"/>
+          <w:numId w:val="3"/>
+        </w:numPr>
+      </w:pPr>
+      <w:r>
+        <w:t>Team of two: configured a segmented network with Marketing, Finance and IT VLANs on /27 subnets, with static and default routes between the ISP and NYP routers</w:t>
+      </w:r>
+    </w:p>
+    <w:p>
+      <w:pPr>
+        <w:numPr>
+          <w:ilvl w:val="0"/>
+          <w:numId w:val="3"/>
+        </w:numPr>
+      </w:pPr>
+      <w:r>
+        <w:t>Set up DNS, DHCP, HTTP and RDP on Windows Server, with PCs joining the domain</w:t>
+      </w:r>
+    </w:p>
+    <w:p>
+      <w:pPr>
+        <w:numPr>
+          <w:ilvl w:val="0"/>
+          <w:numId w:val="3"/>
+        </w:numPr>
+      </w:pPr>
+      <w:r>
+        <w:t>Wrote extended ACLs per VLAN for HTTPS, RDP and SFTP (IT can remote into Marketing but not Finance); fixed a routing gap to the ISP loopback and an ACL that broke DHCP</w:t>
+      </w:r>
+    </w:p>
+    <w:p>
+      <w:pPr>
+        <w:tabs>
+          <w:tab w:val="right" w:pos="10800"/>
+        </w:tabs>
+        <w:spacing w:before="60"/>
+      </w:pPr>
+      <w:r>
+        <w:rPr>
+          <w:b/>
+          <w:bCs/>
+        </w:rPr>
+        <w:t xml:space="preserve">VMware vSphere Virtual Infrastructure | vCenter, </w:t>
+      </w:r>
+      <w:proofErr w:type="spellStart"/>
+      <w:r>
+        <w:rPr>
+          <w:b/>
+          <w:bCs/>
+        </w:rPr>
+        <w:t>ESXi</w:t>
+      </w:r>
+      <w:proofErr w:type="spellEnd"/>
+      <w:r>
+        <w:rPr>
+          <w:b/>
+          <w:bCs/>
+        </w:rPr>
+        <w:t xml:space="preserve">, </w:t>
+      </w:r>
+      <w:proofErr w:type="spellStart"/>
+      <w:r>
+        <w:rPr>
+          <w:b/>
+          <w:bCs/>
+        </w:rPr>
+        <w:t>vMotion</w:t>
+      </w:r>
+      <w:proofErr w:type="spellEnd"/>
+      <w:r>
+        <w:rPr>
+          <w:b/>
+          <w:bCs/>
+        </w:rPr>
+        <w:t xml:space="preserve">, HA, DRS </w:t>
+      </w:r>
+      <w:r>
+        <w:tab/>
+        <w:t>2024</w:t>
+      </w:r>
+    </w:p>
+    <w:p>
+      <w:pPr>
+        <w:numPr>
+          <w:ilvl w:val="0"/>
+          <w:numId w:val="4"/>
+        </w:numPr>
+      </w:pPr>
+      <w:r>
+        <w:t xml:space="preserve">Deployed vCenter, a </w:t>
+      </w:r>
+      <w:r>
+        <w:t>datacentre</w:t>
+      </w:r>
+      <w:r>
+        <w:t xml:space="preserve">, content library and VM template; configured </w:t>
+      </w:r>
+      <w:proofErr w:type="spellStart"/>
+      <w:r>
+        <w:t>vMotion</w:t>
+      </w:r>
+      <w:proofErr w:type="spellEnd"/>
+      <w:r>
+        <w:t xml:space="preserve"> across two </w:t>
+      </w:r>
+      <w:proofErr w:type="spellStart"/>
+      <w:r>
+        <w:t>ESXi</w:t>
+      </w:r>
+      <w:proofErr w:type="spellEnd"/>
+      <w:r>
+        <w:t xml:space="preserve"> hosts, with HA and DRS verified by shutting down a host</w:t>
+      </w:r>
+    </w:p>
+    <w:p>
+      <w:pPr>
+        <w:numPr>
+          <w:ilvl w:val="0"/>
+          <w:numId w:val="4"/>
+        </w:numPr>
+      </w:pPr>
+      <w:r>
+        <w:t>Created a CPU alarm (above 90%) that restarts the VM, validated with a load-test script; compared Hyper-V and Red Hat Virtualization on features, scalability, licensing and cloud integration</w:t>
+      </w:r>
+    </w:p>
+    <w:p>
+      <w:pPr>
         <w:pBdr>
           <w:bottom w:val="single" w:sz="6" w:space="1" w:color="1F3A5F"/>
         </w:pBdr>
@@ -656,23 +741,7 @@
           <w:b/>
           <w:bCs/>
         </w:rPr>
-        <w:t xml:space="preserve">Vice President, Engagement &amp; </w:t>
-      </w:r>
-      <w:proofErr w:type="gramStart"/>
-      <w:r>
-        <w:rPr>
-          <w:b/>
-          <w:bCs/>
-        </w:rPr>
-        <w:t>Safety  |</w:t>
-      </w:r>
-      <w:proofErr w:type="gramEnd"/>
-      <w:r>
-        <w:rPr>
-          <w:b/>
-          <w:bCs/>
-        </w:rPr>
-        <w:t xml:space="preserve">  AC (FinTech) Student Management Committee, SIT</w:t>
+        <w:t>Vice President, Engagement &amp; Safety  |  AC (FinTech) Student Management Committee, SIT</w:t>
       </w:r>
       <w:r>
         <w:tab/>
@@ -694,7 +763,13 @@
         </w:numPr>
       </w:pPr>
       <w:r>
-        <w:t>Plan and run events for a 270-student Applied Computing (FinTech) cohort, working with a 10-member committee</w:t>
+        <w:t xml:space="preserve">Plan and run events for a </w:t>
+      </w:r>
+      <w:r>
+        <w:t>390</w:t>
+      </w:r>
+      <w:r>
+        <w:t>-student Applied Computing (FinTech) cohort, working with a 10-member committee</w:t>
       </w:r>
     </w:p>
     <w:p>
@@ -742,23 +817,7 @@
           <w:b/>
           <w:bCs/>
         </w:rPr>
-        <w:t xml:space="preserve"> </w:t>
-      </w:r>
-      <w:proofErr w:type="gramStart"/>
-      <w:r>
-        <w:rPr>
-          <w:b/>
-          <w:bCs/>
-        </w:rPr>
-        <w:t>Ambassador  |</w:t>
-      </w:r>
-      <w:proofErr w:type="gramEnd"/>
-      <w:r>
-        <w:rPr>
-          <w:b/>
-          <w:bCs/>
-        </w:rPr>
-        <w:t xml:space="preserve">  Communications Team, SIT</w:t>
+        <w:t xml:space="preserve"> Ambassador  |  Communications Team, SIT</w:t>
       </w:r>
       <w:r>
         <w:tab/>
@@ -795,23 +854,7 @@
           <w:b/>
           <w:bCs/>
         </w:rPr>
-        <w:t xml:space="preserve">Assistant Logistics </w:t>
-      </w:r>
-      <w:proofErr w:type="gramStart"/>
-      <w:r>
-        <w:rPr>
-          <w:b/>
-          <w:bCs/>
-        </w:rPr>
-        <w:t>Head  |</w:t>
-      </w:r>
-      <w:proofErr w:type="gramEnd"/>
-      <w:r>
-        <w:rPr>
-          <w:b/>
-          <w:bCs/>
-        </w:rPr>
-        <w:t xml:space="preserve">  Inter-Cluster Games, SIT</w:t>
+        <w:t>Assistant Logistics Head  |  Inter-Cluster Games, SIT</w:t>
       </w:r>
       <w:r>
         <w:tab/>
@@ -858,6 +901,7 @@
           <w:sz w:val="21"/>
           <w:szCs w:val="21"/>
         </w:rPr>
+        <w:lastRenderedPageBreak/>
         <w:t>SKILLS &amp; CERTIFICATIONS</w:t>
       </w:r>
     </w:p>
@@ -1092,6 +1136,304 @@
       <w:lvlJc w:val="left"/>
     </w:lvl>
   </w:abstractNum>
+  <w:abstractNum w:abstractNumId="2" w15:restartNumberingAfterBreak="0">
+    <w:nsid w:val="63A46528"/>
+    <w:multiLevelType w:val="multilevel"/>
+    <w:tmpl w:val="EC84264C"/>
+    <w:lvl w:ilvl="0">
+      <w:start w:val="1"/>
+      <w:numFmt w:val="bullet"/>
+      <w:lvlText w:val=""/>
+      <w:lvlJc w:val="left"/>
+      <w:pPr>
+        <w:tabs>
+          <w:tab w:val="num" w:pos="720"/>
+        </w:tabs>
+        <w:ind w:left="720" w:hanging="360"/>
+      </w:pPr>
+      <w:rPr>
+        <w:rFonts w:ascii="Symbol" w:hAnsi="Symbol" w:hint="default"/>
+        <w:sz w:val="20"/>
+      </w:rPr>
+    </w:lvl>
+    <w:lvl w:ilvl="1" w:tentative="1">
+      <w:start w:val="1"/>
+      <w:numFmt w:val="bullet"/>
+      <w:lvlText w:val="o"/>
+      <w:lvlJc w:val="left"/>
+      <w:pPr>
+        <w:tabs>
+          <w:tab w:val="num" w:pos="1440"/>
+        </w:tabs>
+        <w:ind w:left="1440" w:hanging="360"/>
+      </w:pPr>
+      <w:rPr>
+        <w:rFonts w:ascii="Courier New" w:hAnsi="Courier New" w:hint="default"/>
+        <w:sz w:val="20"/>
+      </w:rPr>
+    </w:lvl>
+    <w:lvl w:ilvl="2" w:tentative="1">
+      <w:start w:val="1"/>
+      <w:numFmt w:val="bullet"/>
+      <w:lvlText w:val=""/>
+      <w:lvlJc w:val="left"/>
+      <w:pPr>
+        <w:tabs>
+          <w:tab w:val="num" w:pos="2160"/>
+        </w:tabs>
+        <w:ind w:left="2160" w:hanging="360"/>
+      </w:pPr>
+      <w:rPr>
+        <w:rFonts w:ascii="Wingdings" w:hAnsi="Wingdings" w:hint="default"/>
+        <w:sz w:val="20"/>
+      </w:rPr>
+    </w:lvl>
+    <w:lvl w:ilvl="3" w:tentative="1">
+      <w:start w:val="1"/>
+      <w:numFmt w:val="bullet"/>
+      <w:lvlText w:val=""/>
+      <w:lvlJc w:val="left"/>
+      <w:pPr>
+        <w:tabs>
+          <w:tab w:val="num" w:pos="2880"/>
+        </w:tabs>
+        <w:ind w:left="2880" w:hanging="360"/>
+      </w:pPr>
+      <w:rPr>
+        <w:rFonts w:ascii="Wingdings" w:hAnsi="Wingdings" w:hint="default"/>
+        <w:sz w:val="20"/>
+      </w:rPr>
+    </w:lvl>
+    <w:lvl w:ilvl="4" w:tentative="1">
+      <w:start w:val="1"/>
+      <w:numFmt w:val="bullet"/>
+      <w:lvlText w:val=""/>
+      <w:lvlJc w:val="left"/>
+      <w:pPr>
+        <w:tabs>
+          <w:tab w:val="num" w:pos="3600"/>
+        </w:tabs>
+        <w:ind w:left="3600" w:hanging="360"/>
+      </w:pPr>
+      <w:rPr>
+        <w:rFonts w:ascii="Wingdings" w:hAnsi="Wingdings" w:hint="default"/>
+        <w:sz w:val="20"/>
+      </w:rPr>
+    </w:lvl>
+    <w:lvl w:ilvl="5" w:tentative="1">
+      <w:start w:val="1"/>
+      <w:numFmt w:val="bullet"/>
+      <w:lvlText w:val=""/>
+      <w:lvlJc w:val="left"/>
+      <w:pPr>
+        <w:tabs>
+          <w:tab w:val="num" w:pos="4320"/>
+        </w:tabs>
+        <w:ind w:left="4320" w:hanging="360"/>
+      </w:pPr>
+      <w:rPr>
+        <w:rFonts w:ascii="Wingdings" w:hAnsi="Wingdings" w:hint="default"/>
+        <w:sz w:val="20"/>
+      </w:rPr>
+    </w:lvl>
+    <w:lvl w:ilvl="6" w:tentative="1">
+      <w:start w:val="1"/>
+      <w:numFmt w:val="bullet"/>
+      <w:lvlText w:val=""/>
+      <w:lvlJc w:val="left"/>
+      <w:pPr>
+        <w:tabs>
+          <w:tab w:val="num" w:pos="5040"/>
+        </w:tabs>
+        <w:ind w:left="5040" w:hanging="360"/>
+      </w:pPr>
+      <w:rPr>
+        <w:rFonts w:ascii="Wingdings" w:hAnsi="Wingdings" w:hint="default"/>
+        <w:sz w:val="20"/>
+      </w:rPr>
+    </w:lvl>
+    <w:lvl w:ilvl="7" w:tentative="1">
+      <w:start w:val="1"/>
+      <w:numFmt w:val="bullet"/>
+      <w:lvlText w:val=""/>
+      <w:lvlJc w:val="left"/>
+      <w:pPr>
+        <w:tabs>
+          <w:tab w:val="num" w:pos="5760"/>
+        </w:tabs>
+        <w:ind w:left="5760" w:hanging="360"/>
+      </w:pPr>
+      <w:rPr>
+        <w:rFonts w:ascii="Wingdings" w:hAnsi="Wingdings" w:hint="default"/>
+        <w:sz w:val="20"/>
+      </w:rPr>
+    </w:lvl>
+    <w:lvl w:ilvl="8" w:tentative="1">
+      <w:start w:val="1"/>
+      <w:numFmt w:val="bullet"/>
+      <w:lvlText w:val=""/>
+      <w:lvlJc w:val="left"/>
+      <w:pPr>
+        <w:tabs>
+          <w:tab w:val="num" w:pos="6480"/>
+        </w:tabs>
+        <w:ind w:left="6480" w:hanging="360"/>
+      </w:pPr>
+      <w:rPr>
+        <w:rFonts w:ascii="Wingdings" w:hAnsi="Wingdings" w:hint="default"/>
+        <w:sz w:val="20"/>
+      </w:rPr>
+    </w:lvl>
+  </w:abstractNum>
+  <w:abstractNum w:abstractNumId="3" w15:restartNumberingAfterBreak="0">
+    <w:nsid w:val="67770359"/>
+    <w:multiLevelType w:val="multilevel"/>
+    <w:tmpl w:val="31C6BF3E"/>
+    <w:lvl w:ilvl="0">
+      <w:start w:val="1"/>
+      <w:numFmt w:val="bullet"/>
+      <w:lvlText w:val=""/>
+      <w:lvlJc w:val="left"/>
+      <w:pPr>
+        <w:tabs>
+          <w:tab w:val="num" w:pos="720"/>
+        </w:tabs>
+        <w:ind w:left="720" w:hanging="360"/>
+      </w:pPr>
+      <w:rPr>
+        <w:rFonts w:ascii="Symbol" w:hAnsi="Symbol" w:hint="default"/>
+        <w:sz w:val="20"/>
+      </w:rPr>
+    </w:lvl>
+    <w:lvl w:ilvl="1" w:tentative="1">
+      <w:start w:val="1"/>
+      <w:numFmt w:val="bullet"/>
+      <w:lvlText w:val="o"/>
+      <w:lvlJc w:val="left"/>
+      <w:pPr>
+        <w:tabs>
+          <w:tab w:val="num" w:pos="1440"/>
+        </w:tabs>
+        <w:ind w:left="1440" w:hanging="360"/>
+      </w:pPr>
+      <w:rPr>
+        <w:rFonts w:ascii="Courier New" w:hAnsi="Courier New" w:hint="default"/>
+        <w:sz w:val="20"/>
+      </w:rPr>
+    </w:lvl>
+    <w:lvl w:ilvl="2" w:tentative="1">
+      <w:start w:val="1"/>
+      <w:numFmt w:val="bullet"/>
+      <w:lvlText w:val=""/>
+      <w:lvlJc w:val="left"/>
+      <w:pPr>
+        <w:tabs>
+          <w:tab w:val="num" w:pos="2160"/>
+        </w:tabs>
+        <w:ind w:left="2160" w:hanging="360"/>
+      </w:pPr>
+      <w:rPr>
+        <w:rFonts w:ascii="Wingdings" w:hAnsi="Wingdings" w:hint="default"/>
+        <w:sz w:val="20"/>
+      </w:rPr>
+    </w:lvl>
+    <w:lvl w:ilvl="3" w:tentative="1">
+      <w:start w:val="1"/>
+      <w:numFmt w:val="bullet"/>
+      <w:lvlText w:val=""/>
+      <w:lvlJc w:val="left"/>
+      <w:pPr>
+        <w:tabs>
+          <w:tab w:val="num" w:pos="2880"/>
+        </w:tabs>
+        <w:ind w:left="2880" w:hanging="360"/>
+      </w:pPr>
+      <w:rPr>
+        <w:rFonts w:ascii="Wingdings" w:hAnsi="Wingdings" w:hint="default"/>
+        <w:sz w:val="20"/>
+      </w:rPr>
+    </w:lvl>
+    <w:lvl w:ilvl="4" w:tentative="1">
+      <w:start w:val="1"/>
+      <w:numFmt w:val="bullet"/>
+      <w:lvlText w:val=""/>
+      <w:lvlJc w:val="left"/>
+      <w:pPr>
+        <w:tabs>
+          <w:tab w:val="num" w:pos="3600"/>
+        </w:tabs>
+        <w:ind w:left="3600" w:hanging="360"/>
+      </w:pPr>
+      <w:rPr>
+        <w:rFonts w:ascii="Wingdings" w:hAnsi="Wingdings" w:hint="default"/>
+        <w:sz w:val="20"/>
+      </w:rPr>
+    </w:lvl>
+    <w:lvl w:ilvl="5" w:tentative="1">
+      <w:start w:val="1"/>
+      <w:numFmt w:val="bullet"/>
+      <w:lvlText w:val=""/>
+      <w:lvlJc w:val="left"/>
+      <w:pPr>
+        <w:tabs>
+          <w:tab w:val="num" w:pos="4320"/>
+        </w:tabs>
+        <w:ind w:left="4320" w:hanging="360"/>
+      </w:pPr>
+      <w:rPr>
+        <w:rFonts w:ascii="Wingdings" w:hAnsi="Wingdings" w:hint="default"/>
+        <w:sz w:val="20"/>
+      </w:rPr>
+    </w:lvl>
+    <w:lvl w:ilvl="6" w:tentative="1">
+      <w:start w:val="1"/>
+      <w:numFmt w:val="bullet"/>
+      <w:lvlText w:val=""/>
+      <w:lvlJc w:val="left"/>
+      <w:pPr>
+        <w:tabs>
+          <w:tab w:val="num" w:pos="5040"/>
+        </w:tabs>
+        <w:ind w:left="5040" w:hanging="360"/>
+      </w:pPr>
+      <w:rPr>
+        <w:rFonts w:ascii="Wingdings" w:hAnsi="Wingdings" w:hint="default"/>
+        <w:sz w:val="20"/>
+      </w:rPr>
+    </w:lvl>
+    <w:lvl w:ilvl="7" w:tentative="1">
+      <w:start w:val="1"/>
+      <w:numFmt w:val="bullet"/>
+      <w:lvlText w:val=""/>
+      <w:lvlJc w:val="left"/>
+      <w:pPr>
+        <w:tabs>
+          <w:tab w:val="num" w:pos="5760"/>
+        </w:tabs>
+        <w:ind w:left="5760" w:hanging="360"/>
+      </w:pPr>
+      <w:rPr>
+        <w:rFonts w:ascii="Wingdings" w:hAnsi="Wingdings" w:hint="default"/>
+        <w:sz w:val="20"/>
+      </w:rPr>
+    </w:lvl>
+    <w:lvl w:ilvl="8" w:tentative="1">
+      <w:start w:val="1"/>
+      <w:numFmt w:val="bullet"/>
+      <w:lvlText w:val=""/>
+      <w:lvlJc w:val="left"/>
+      <w:pPr>
+        <w:tabs>
+          <w:tab w:val="num" w:pos="6480"/>
+        </w:tabs>
+        <w:ind w:left="6480" w:hanging="360"/>
+      </w:pPr>
+      <w:rPr>
+        <w:rFonts w:ascii="Wingdings" w:hAnsi="Wingdings" w:hint="default"/>
+        <w:sz w:val="20"/>
+      </w:rPr>
+    </w:lvl>
+  </w:abstractNum>
   <w:num w:numId="1" w16cid:durableId="1360206252">
     <w:abstractNumId w:val="0"/>
     <w:lvlOverride w:ilvl="0">
@@ -1103,6 +1445,12 @@
     <w:lvlOverride w:ilvl="0">
       <w:startOverride w:val="1"/>
     </w:lvlOverride>
+  </w:num>
+  <w:num w:numId="3" w16cid:durableId="1239485152">
+    <w:abstractNumId w:val="2"/>
+  </w:num>
+  <w:num w:numId="4" w16cid:durableId="352725610">
+    <w:abstractNumId w:val="3"/>
   </w:num>
 </w:numbering>
 </file>
@@ -1587,7 +1935,6 @@
   <w:style w:type="character" w:default="1" w:styleId="DefaultParagraphFont">
     <w:name w:val="Default Paragraph Font"/>
     <w:uiPriority w:val="1"/>
-    <w:semiHidden/>
     <w:unhideWhenUsed/>
   </w:style>
   <w:style w:type="table" w:default="1" w:styleId="TableNormal">

</xml_diff>